<commit_message>
feat(reportes-dashboard): mejorar inicio por rol, dashboard y reportes CSV
</commit_message>
<xml_diff>
--- a/docs/documentos/T1_GRUPO_03_dashboard_reportes.docx
+++ b/docs/documentos/T1_GRUPO_03_dashboard_reportes.docx
@@ -7253,7 +7253,7 @@
             </w:r>
             <w:r/>
             <w:r>
-              <w:t>El Administrador consulta productos activos, productos con stock bajo, entradas y salidas del día y hasta 20 productos por reponer. La vista se actualiza al cargar o reintentar y no exporta archivos.</w:t>
+              <w:t>El Administrador consulta productos activos, productos con stock bajo, órdenes Pendientes o Parciales y documentos vigentes de entrada y salida del día. El resumen incluye 30 días de actividad y hasta 20 productos por reponer; la pantalla destaca cinco. Se actualiza al cargar o reintentar y no exporta archivos.</w:t>
             </w:r>
           </w:p>
           <w:p>
@@ -7398,7 +7398,7 @@
             </w:r>
             <w:r/>
             <w:r>
-              <w:t>El Administrador consulta inventario, movimientos y reposición con filtros y paginación. El producto filtra los tres reportes; fechas, tipo y usuario filtran movimientos. Cuando hay datos puede exportar PDF o Excel, hasta 10 000 registros.</w:t>
+              <w:t>El Administrador consulta inventario, movimientos y reposición con filtros y paginación. El producto filtra los tres reportes; fechas, tipo y usuario filtran movimientos. La pantalla identifica el stock bajo y permite limpiar filtros. Cuando hay datos puede exportar PDF o CSV con los filtros aplicados, hasta 10 000 registros. El inventario exportado incluye el precio de compra referencial y el estado de stock.</w:t>
             </w:r>
           </w:p>
           <w:p>
@@ -7457,7 +7457,7 @@
               <w:spacing w:before="4" w:line="477" w:lineRule="auto"/>
             </w:pPr>
             <w:r>
-              <w:t>El cliente Angular cerrará sesión eliminando el JWT local y redirigiendo al inicio; esta función no es un endpoint del backend.</w:t>
+              <w:t>El cliente Angular cerrará sesión eliminando el JWT local y redirigiendo al login; esta función no es un endpoint del backend.</w:t>
             </w:r>
           </w:p>
           <w:p>
@@ -7735,7 +7735,7 @@
         </w:rPr>
       </w:pPr>
       <w:r>
-        <w:t>El Administrador gestiona usuarios, categorías, productos, proveedores y órdenes de compra; registra y corrige ajustes, consulta documentos y movimientos y accede al dashboard y a los reportes. También puede registrar, rectificar o anular entradas y salidas. Su acceso a cada endpoint se controla mediante el rol autenticado.</w:t>
+        <w:t>El Administrador gestiona usuarios, categorías, productos, proveedores y órdenes de compra; registra y corrige ajustes, consulta documentos y movimientos y accede al dashboard y a los reportes. También puede registrar, rectificar o anular entradas y salidas. Tras iniciar sesión, Angular lo dirige al Dashboard. Su acceso a cada endpoint se controla mediante el rol autenticado.</w:t>
       </w:r>
     </w:p>
     <w:p>
@@ -7766,7 +7766,7 @@
         </w:rPr>
       </w:pPr>
       <w:r>
-        <w:t>El Operador de Almacén consulta productos, proveedores y órdenes de compra. Registra, consulta, rectifica y anula entradas y salidas con motivo de corrección cuando corresponde. No modifica catálogos ni órdenes, no realiza ajustes y no accede a documentos, movimientos administrativos, dashboard o reportes.</w:t>
+        <w:t>El Operador de Almacén consulta productos, proveedores y órdenes de compra. Registra, consulta, rectifica y anula entradas y salidas con motivo de corrección cuando corresponde. Tras iniciar sesión, Angular lo dirige al listado de órdenes de compra. No modifica catálogos ni órdenes, no realiza ajustes y no accede a documentos, movimientos administrativos, dashboard o reportes.</w:t>
       </w:r>
     </w:p>
     <w:p>
@@ -7881,7 +7881,7 @@
         <w:ind w:left="710" w:right="890" w:firstLine="719"/>
       </w:pPr>
       <w:r>
-        <w:t>El ciclo inicia con una orden Pendiente para un proveedor activo. Incluye productos activos asignados a él, sin repeticiones, con cantidades y precios pactados. El precio del catálogo es una sugerencia editable y no cambia órdenes previas. El Administrador solo edita una orden Pendiente sin entradas y puede cancelar una Pendiente o Parcial. Los estados son Pendiente, Parcial, Recibida y Cancelada.</w:t>
+        <w:t>Una orden pertenece a un proveedor activo; inicia Pendiente y admite sus productos activos, sin repetir. Guarda cantidad y precio pactado por línea; el precio de catálogo es una sugerencia editable para nuevas órdenes. El Administrador solo edita Pendientes sin entradas y cancela Pendientes o Parciales.</w:t>
       </w:r>
     </w:p>
     <w:p>
@@ -19499,7 +19499,7 @@
               <w:jc w:val="center"/>
             </w:pPr>
             <w:r>
-              <w:t>Exportar PDF o Excel</w:t>
+              <w:t>Exportar PDF o CSV</w:t>
             </w:r>
           </w:p>
         </w:tc>
@@ -36052,7 +36052,7 @@
       </w:r>
       <w:r/>
       <w:r>
-        <w:t>En la Figura 36 se muestra la respuesta HTTP 200 del resumen consultado por un Administrador. La pantalla Angular consume este endpoint para mostrar cuatro indicadores y hasta 20 productos por reponer; se actualiza al cargar o reintentar.</w:t>
+        <w:t>En la Figura 36 se muestra la respuesta HTTP 200 del resumen consultado por un Administrador. La versión actual del endpoint añade las órdenes por completar y 30 días de entradas y salidas vigentes. Angular muestra cuatro tarjetas, una tendencia diaria y los cinco productos prioritarios de los hasta 20 entregados por la API; se actualiza al cargar o reintentar.</w:t>
       </w:r>
     </w:p>
     <w:p>
@@ -36732,7 +36732,7 @@
       </w:r>
       <w:r/>
       <w:r>
-        <w:t>En la Figura 38 se presenta la respuesta del reporte de reposición. La pantalla Angular muestra los resultados paginados, permite filtrar por producto y ofrece descargar PDF o Excel solo cuando hay registros.</w:t>
+        <w:t>En la Figura 38 se presenta la respuesta del reporte de reposición. La pantalla Angular muestra los resultados paginados, permite filtrar por producto, limpiar filtros y descargar PDF o CSV solo cuando hay registros.</w:t>
       </w:r>
     </w:p>
     <w:p>
@@ -37061,7 +37061,7 @@
       </w:r>
       <w:r/>
       <w:r>
-        <w:t>En la Figura 39 se evidencia la exportación del reporte de inventario en Excel. El backend genera el archivo con todos los resultados de la consulta hasta 10 000 registros; devuelve 204 cuando no hay datos y pide aplicar filtros si se supera el límite.</w:t>
+        <w:t>La Figura 39 conserva la evidencia de la exportación inicial del inventario en Excel; la versión actual ofrece PDF y CSV. El archivo incluye el precio de compra referencial y el estado de stock junto con las demás columnas y aplica los filtros de la consulta. El backend exporta hasta 10 000 registros, devuelve 204 cuando no hay datos y pide aplicar filtros si se supera el límite.</w:t>
       </w:r>
     </w:p>
     <w:p>
@@ -37283,7 +37283,7 @@
           <w:i/>
           <w:spacing w:val="-2"/>
         </w:rPr>
-        <w:t>Excel.</w:t>
+        <w:t>Excel (versión inicial).</w:t>
       </w:r>
     </w:p>
     <w:p>

</xml_diff>